<commit_message>
Upgrade modeled telemetry to second-by-second resolution
- modeled_reentry_table now has 1,141 rows (one per second, 0:00→19:00)
- Previously 10-second resolution (117 rows)
- Updated notes to reflect second-by-second granularity
- All formats regenerated: csv/md/txt/docx/pdf
</commit_message>
<xml_diff>
--- a/modeled_reentry_notes.docx
+++ b/modeled_reentry_notes.docx
@@ -1052,7 +1052,23 @@
         <w:pStyle w:val="BodyText"/>
       </w:pPr>
       <w:r>
-        <w:t xml:space="preserve">Full 10-second-resolution table:</w:t>
+        <w:t xml:space="preserve">Full</w:t>
+      </w:r>
+      <w:r>
+        <w:t xml:space="preserve"> </w:t>
+      </w:r>
+      <w:r>
+        <w:rPr>
+          <w:bCs/>
+          <w:b/>
+        </w:rPr>
+        <w:t xml:space="preserve">second-by-second</w:t>
+      </w:r>
+      <w:r>
+        <w:t xml:space="preserve"> </w:t>
+      </w:r>
+      <w:r>
+        <w:t xml:space="preserve">table (1,141 rows, 0:00→19:00):</w:t>
       </w:r>
       <w:r>
         <w:t xml:space="preserve"> </w:t>

</xml_diff>